<commit_message>
fix: inserir placeholders nos templates Word de fatura
- NOSSONUMERO: campo 'Nosso número' (estava vazio)
- CONTABANCARIA: substituiu 'Banco Itaú AG: 8493 C/C: 99569-3' fixo
- PERCENTUALDESCONTO: substituiu '40,12 %' fixo
- NUMEROCONTRATO: campo 'Número do contrato / Processo' (estava vazio)
- RETENCAOESFERA: campo 'Retenções' (estava vazio)
- Todos os 11 templates (fatura_50 a fatura_300) atualizados
- Script fix_templates.py para referência futura
</commit_message>
<xml_diff>
--- a/production/public/fatura_100.docx
+++ b/production/public/fatura_100.docx
@@ -119,6 +119,9 @@
                 <w:bCs/>
               </w:rPr>
             </w:pPr>
+            <w:r>
+              <w:t>NUMEROCONTRATO</w:t>
+            </w:r>
           </w:p>
         </w:tc>
       </w:tr>
@@ -427,6 +430,13 @@
                 <w:bCs/>
               </w:rPr>
             </w:pPr>
+            <w:r>
+              <w:rPr>
+                <w:b/>
+                <w:bCs/>
+              </w:rPr>
+              <w:t>RETENCAOESFERA</w:t>
+            </w:r>
           </w:p>
         </w:tc>
       </w:tr>
@@ -12111,6 +12121,9 @@
               </w:tabs>
               <w:jc w:val="right"/>
             </w:pPr>
+            <w:r>
+              <w:t>NOSSONUMERO</w:t>
+            </w:r>
           </w:p>
         </w:tc>
       </w:tr>
@@ -12599,43 +12612,17 @@
                 <w:sz w:val="22"/>
                 <w:szCs w:val="22"/>
               </w:rPr>
-              <w:t xml:space="preserve">Banco Itaú </w:t>
-            </w:r>
-          </w:p>
-          <w:p>
-            <w:pPr>
-              <w:pStyle w:val="Default"/>
-              <w:rPr>
-                <w:sz w:val="22"/>
-                <w:szCs w:val="22"/>
-              </w:rPr>
-            </w:pPr>
-            <w:r>
-              <w:rPr>
-                <w:sz w:val="22"/>
-                <w:szCs w:val="22"/>
-              </w:rPr>
-              <w:t xml:space="preserve">AG: 8493 </w:t>
-            </w:r>
-          </w:p>
-          <w:p>
-            <w:pPr>
-              <w:tabs>
-                <w:tab w:val="center" w:pos="2508"/>
-              </w:tabs>
-            </w:pPr>
-            <w:r>
-              <w:t>C/C: 99569-3</w:t>
-            </w:r>
-          </w:p>
-          <w:p>
-            <w:pPr>
-              <w:tabs>
-                <w:tab w:val="center" w:pos="2508"/>
-              </w:tabs>
-            </w:pPr>
-            <w:r>
-              <w:t>Preços já com descontos aplicados de 40,12 %</w:t>
+              <w:t xml:space="preserve">CONTABANCARIA</w:t>
+            </w:r>
+          </w:p>
+          <w:p>
+            <w:pPr>
+              <w:tabs>
+                <w:tab w:val="center" w:pos="2508"/>
+              </w:tabs>
+            </w:pPr>
+            <w:r>
+              <w:t>Preços já com descontos aplicados de PERCENTUALDESCONTO</w:t>
             </w:r>
           </w:p>
         </w:tc>

</xml_diff>